<commit_message>
se implementa dockerisacion y tar , subida a oracle, se arreglan ultimos puntos y se solventan erres en backend y detector
</commit_message>
<xml_diff>
--- a/Gestión/1.1.2 Documento de registro de definición e identificación del proyecto.docx
+++ b/Gestión/1.1.2 Documento de registro de definición e identificación del proyecto.docx
@@ -870,12 +870,12 @@
                   <wp:extent cx="502920" cy="502920"/>
                   <wp:effectExtent b="0" l="0" r="0" t="0"/>
                   <wp:wrapNone/>
-                  <wp:docPr descr="Código QR con relleno sólido" id="2106009978" name="image4.png"/>
+                  <wp:docPr descr="Código QR con relleno sólido" id="2106009978" name="image5.png"/>
                   <a:graphic>
                     <a:graphicData uri="http://schemas.openxmlformats.org/drawingml/2006/picture">
                       <pic:pic>
                         <pic:nvPicPr>
-                          <pic:cNvPr descr="Código QR con relleno sólido" id="0" name="image4.png"/>
+                          <pic:cNvPr descr="Código QR con relleno sólido" id="0" name="image5.png"/>
                           <pic:cNvPicPr preferRelativeResize="0"/>
                         </pic:nvPicPr>
                         <pic:blipFill>
@@ -1417,12 +1417,12 @@
                 <wp:inline distB="0" distT="0" distL="0" distR="0">
                   <wp:extent cx="432019" cy="432019"/>
                   <wp:effectExtent b="0" l="0" r="0" t="0"/>
-                  <wp:docPr descr="Inteligencia artificial con relleno sólido" id="2106009981" name="image3.png"/>
+                  <wp:docPr descr="Inteligencia artificial con relleno sólido" id="2106009981" name="image6.png"/>
                   <a:graphic>
                     <a:graphicData uri="http://schemas.openxmlformats.org/drawingml/2006/picture">
                       <pic:pic>
                         <pic:nvPicPr>
-                          <pic:cNvPr descr="Inteligencia artificial con relleno sólido" id="0" name="image3.png"/>
+                          <pic:cNvPr descr="Inteligencia artificial con relleno sólido" id="0" name="image6.png"/>
                           <pic:cNvPicPr preferRelativeResize="0"/>
                         </pic:nvPicPr>
                         <pic:blipFill>
@@ -4381,45 +4381,6 @@
         </w:rPr>
       </w:r>
     </w:p>
-    <w:p>
-      <w:pPr>
-        <w:spacing w:after="160" w:line="259" w:lineRule="auto"/>
-        <w:rPr>
-          <w:rFonts w:ascii="Calibri" w:cs="Calibri" w:eastAsia="Calibri" w:hAnsi="Calibri"/>
-        </w:rPr>
-      </w:pPr>
-      <w:r>
-        <w:rPr>
-          <w:rtl w:val="0"/>
-        </w:rPr>
-      </w:r>
-    </w:p>
-    <w:p>
-      <w:pPr>
-        <w:spacing w:after="160" w:line="259" w:lineRule="auto"/>
-        <w:rPr>
-          <w:rFonts w:ascii="Calibri" w:cs="Calibri" w:eastAsia="Calibri" w:hAnsi="Calibri"/>
-        </w:rPr>
-      </w:pPr>
-      <w:r>
-        <w:rPr>
-          <w:rtl w:val="0"/>
-        </w:rPr>
-      </w:r>
-    </w:p>
-    <w:p>
-      <w:pPr>
-        <w:spacing w:after="160" w:line="259" w:lineRule="auto"/>
-        <w:rPr>
-          <w:rFonts w:ascii="Calibri" w:cs="Calibri" w:eastAsia="Calibri" w:hAnsi="Calibri"/>
-        </w:rPr>
-      </w:pPr>
-      <w:r>
-        <w:rPr>
-          <w:rtl w:val="0"/>
-        </w:rPr>
-      </w:r>
-    </w:p>
     <w:tbl>
       <w:tblPr>
         <w:tblStyle w:val="Table10"/>
@@ -4571,48 +4532,6 @@
         </w:tc>
       </w:tr>
     </w:tbl>
-    <w:p>
-      <w:pPr>
-        <w:spacing w:line="360" w:lineRule="auto"/>
-        <w:jc w:val="both"/>
-        <w:rPr>
-          <w:rFonts w:ascii="Calibri" w:cs="Calibri" w:eastAsia="Calibri" w:hAnsi="Calibri"/>
-        </w:rPr>
-      </w:pPr>
-      <w:r>
-        <w:rPr>
-          <w:rtl w:val="0"/>
-        </w:rPr>
-      </w:r>
-    </w:p>
-    <w:p>
-      <w:pPr>
-        <w:spacing w:line="360" w:lineRule="auto"/>
-        <w:jc w:val="both"/>
-        <w:rPr>
-          <w:rFonts w:ascii="Calibri" w:cs="Calibri" w:eastAsia="Calibri" w:hAnsi="Calibri"/>
-        </w:rPr>
-      </w:pPr>
-      <w:r>
-        <w:rPr>
-          <w:rtl w:val="0"/>
-        </w:rPr>
-      </w:r>
-    </w:p>
-    <w:p>
-      <w:pPr>
-        <w:spacing w:line="360" w:lineRule="auto"/>
-        <w:jc w:val="both"/>
-        <w:rPr>
-          <w:rFonts w:ascii="Calibri" w:cs="Calibri" w:eastAsia="Calibri" w:hAnsi="Calibri"/>
-        </w:rPr>
-      </w:pPr>
-      <w:r>
-        <w:rPr>
-          <w:rtl w:val="0"/>
-        </w:rPr>
-      </w:r>
-    </w:p>
     <w:p>
       <w:pPr>
         <w:spacing w:line="360" w:lineRule="auto"/>
@@ -5855,33 +5774,14 @@
               <w:jc w:val="both"/>
               <w:rPr>
                 <w:rFonts w:ascii="Calibri" w:cs="Calibri" w:eastAsia="Calibri" w:hAnsi="Calibri"/>
-                <w:color w:val="548dd4"/>
-                <w:sz w:val="20"/>
-                <w:szCs w:val="20"/>
-              </w:rPr>
-            </w:pPr>
-            <w:r>
-              <w:rPr>
-                <w:rFonts w:ascii="Calibri" w:cs="Calibri" w:eastAsia="Calibri" w:hAnsi="Calibri"/>
                 <w:i w:val="1"/>
                 <w:iCs w:val="1"/>
                 <w:color w:val="548dd4"/>
                 <w:sz w:val="20"/>
                 <w:szCs w:val="20"/>
-                <w:rtl w:val="0"/>
-              </w:rPr>
-              <w:t xml:space="preserve">Repositorio:</w:t>
-            </w:r>
-            <w:r>
-              <w:rPr>
-                <w:rtl w:val="0"/>
-              </w:rPr>
-            </w:r>
-          </w:p>
-          <w:p>
-            <w:pPr>
-              <w:spacing w:line="259" w:lineRule="auto"/>
-              <w:jc w:val="both"/>
+              </w:rPr>
+            </w:pPr>
+            <w:r>
               <w:rPr>
                 <w:rFonts w:ascii="Calibri" w:cs="Calibri" w:eastAsia="Calibri" w:hAnsi="Calibri"/>
                 <w:i w:val="1"/>
@@ -5889,79 +5789,9 @@
                 <w:color w:val="548dd4"/>
                 <w:sz w:val="20"/>
                 <w:szCs w:val="20"/>
-              </w:rPr>
-            </w:pPr>
-            <w:r>
-              <w:rPr>
-                <w:rtl w:val="0"/>
-              </w:rPr>
-            </w:r>
-          </w:p>
-          <w:p>
-            <w:pPr>
-              <w:spacing w:line="259" w:lineRule="auto"/>
-              <w:jc w:val="both"/>
-              <w:rPr>
-                <w:rFonts w:ascii="Calibri" w:cs="Calibri" w:eastAsia="Calibri" w:hAnsi="Calibri"/>
-                <w:i w:val="1"/>
-                <w:iCs w:val="1"/>
-                <w:color w:val="548dd4"/>
-                <w:sz w:val="20"/>
-                <w:szCs w:val="20"/>
-              </w:rPr>
-            </w:pPr>
-            <w:r>
-              <w:rPr>
-                <w:rtl w:val="0"/>
-              </w:rPr>
-            </w:r>
-          </w:p>
-          <w:p>
-            <w:pPr>
-              <w:spacing w:line="259" w:lineRule="auto"/>
-              <w:jc w:val="both"/>
-              <w:rPr>
-                <w:rFonts w:ascii="Calibri" w:cs="Calibri" w:eastAsia="Calibri" w:hAnsi="Calibri"/>
-                <w:color w:val="548dd4"/>
-                <w:sz w:val="20"/>
-                <w:szCs w:val="20"/>
-              </w:rPr>
-            </w:pPr>
-            <w:r>
-              <w:rPr>
-                <w:rFonts w:ascii="Calibri" w:cs="Calibri" w:eastAsia="Calibri" w:hAnsi="Calibri"/>
-                <w:i w:val="1"/>
-                <w:iCs w:val="1"/>
-                <w:color w:val="548dd4"/>
-                <w:sz w:val="20"/>
-                <w:szCs w:val="20"/>
-                <w:rtl w:val="0"/>
-              </w:rPr>
-              <w:t xml:space="preserve">Otros:</w:t>
-            </w:r>
-            <w:r>
-              <w:rPr>
-                <w:rtl w:val="0"/>
-              </w:rPr>
-            </w:r>
-          </w:p>
-          <w:p>
-            <w:pPr>
-              <w:spacing w:line="259" w:lineRule="auto"/>
-              <w:jc w:val="both"/>
-              <w:rPr>
-                <w:rFonts w:ascii="Calibri" w:cs="Calibri" w:eastAsia="Calibri" w:hAnsi="Calibri"/>
-                <w:i w:val="1"/>
-                <w:iCs w:val="1"/>
-                <w:color w:val="548dd4"/>
-                <w:sz w:val="20"/>
-                <w:szCs w:val="20"/>
-              </w:rPr>
-            </w:pPr>
-            <w:r>
-              <w:rPr>
-                <w:rtl w:val="0"/>
-              </w:rPr>
+                <w:rtl w:val="0"/>
+              </w:rPr>
+              <w:t xml:space="preserve">Repositorio:</w:t>
             </w:r>
           </w:p>
           <w:p>
@@ -5975,6 +5805,18 @@
                 <w:szCs w:val="18"/>
               </w:rPr>
             </w:pPr>
+            <w:r>
+              <w:rPr>
+                <w:rFonts w:ascii="Calibri" w:cs="Calibri" w:eastAsia="Calibri" w:hAnsi="Calibri"/>
+                <w:i w:val="1"/>
+                <w:iCs w:val="1"/>
+                <w:color w:val="548dd4"/>
+                <w:sz w:val="20"/>
+                <w:szCs w:val="20"/>
+                <w:rtl w:val="0"/>
+              </w:rPr>
+              <w:t xml:space="preserve">Otros:</w:t>
+            </w:r>
             <w:r>
               <w:rPr>
                 <w:rtl w:val="0"/>
@@ -9277,21 +9119,6 @@
           <w:color w:val="000000"/>
         </w:rPr>
       </w:pPr>
-      <w:r>
-        <w:rPr>
-          <w:rtl w:val="0"/>
-        </w:rPr>
-      </w:r>
-    </w:p>
-    <w:p>
-      <w:pPr>
-        <w:spacing w:line="360" w:lineRule="auto"/>
-        <w:jc w:val="both"/>
-        <w:rPr>
-          <w:rFonts w:ascii="Calibri" w:cs="Calibri" w:eastAsia="Calibri" w:hAnsi="Calibri"/>
-          <w:color w:val="000000"/>
-        </w:rPr>
-      </w:pPr>
       <w:bookmarkStart w:colFirst="0" w:colLast="0" w:name="_heading=h.7e508ymaugr8" w:id="3"/>
       <w:bookmarkEnd w:id="3"/>
       <w:r>
@@ -11107,7 +10934,7 @@
                 <w:szCs w:val="22"/>
                 <w:rtl w:val="0"/>
               </w:rPr>
-              <w:t xml:space="preserve">carta gant</w:t>
+              <w:t xml:space="preserve">carta gantt</w:t>
             </w:r>
           </w:p>
         </w:tc>
@@ -11203,119 +11030,801 @@
           </w:p>
         </w:tc>
       </w:tr>
+      <w:tr>
+        <w:trPr>
+          <w:cantSplit w:val="0"/>
+          <w:trHeight w:val="360" w:hRule="atLeast"/>
+          <w:tblHeader w:val="0"/>
+        </w:trPr>
+        <w:tc>
+          <w:tcPr>
+            <w:tcBorders>
+              <w:top w:color="bfbfbf" w:space="0" w:sz="6" w:val="single"/>
+              <w:left w:color="bfbfbf" w:space="0" w:sz="6" w:val="single"/>
+              <w:bottom w:color="bfbfbf" w:space="0" w:sz="6" w:val="single"/>
+              <w:right w:color="bfbfbf" w:space="0" w:sz="6" w:val="single"/>
+            </w:tcBorders>
+            <w:tcMar>
+              <w:left w:w="105.0" w:type="dxa"/>
+              <w:right w:w="105.0" w:type="dxa"/>
+            </w:tcMar>
+          </w:tcPr>
+          <w:p>
+            <w:pPr>
+              <w:keepNext w:val="0"/>
+              <w:keepLines w:val="0"/>
+              <w:pageBreakBefore w:val="0"/>
+              <w:widowControl w:val="1"/>
+              <w:pBdr>
+                <w:top w:space="0" w:sz="0" w:val="nil"/>
+                <w:left w:space="0" w:sz="0" w:val="nil"/>
+                <w:bottom w:space="0" w:sz="0" w:val="nil"/>
+                <w:right w:space="0" w:sz="0" w:val="nil"/>
+                <w:between w:space="0" w:sz="0" w:val="nil"/>
+              </w:pBdr>
+              <w:shd w:fill="auto" w:val="clear"/>
+              <w:tabs>
+                <w:tab w:val="center" w:leader="none" w:pos="4419"/>
+                <w:tab w:val="right" w:leader="none" w:pos="8838"/>
+              </w:tabs>
+              <w:spacing w:after="0" w:before="0" w:line="240" w:lineRule="auto"/>
+              <w:ind w:left="0" w:right="0" w:firstLine="0"/>
+              <w:jc w:val="center"/>
+              <w:rPr>
+                <w:rFonts w:ascii="Calibri" w:cs="Calibri" w:eastAsia="Calibri" w:hAnsi="Calibri"/>
+                <w:b w:val="0"/>
+                <w:bCs w:val="0"/>
+                <w:i w:val="1"/>
+                <w:iCs w:val="1"/>
+                <w:smallCaps w:val="0"/>
+                <w:strike w:val="0"/>
+                <w:color w:val="5b9bd5"/>
+                <w:sz w:val="18"/>
+                <w:szCs w:val="18"/>
+                <w:u w:val="none"/>
+                <w:shd w:fill="auto" w:val="clear"/>
+                <w:vertAlign w:val="baseline"/>
+              </w:rPr>
+            </w:pPr>
+            <w:r>
+              <w:rPr>
+                <w:rFonts w:ascii="Calibri" w:cs="Calibri" w:eastAsia="Calibri" w:hAnsi="Calibri"/>
+                <w:i w:val="1"/>
+                <w:iCs w:val="1"/>
+                <w:color w:val="5b9bd5"/>
+                <w:sz w:val="18"/>
+                <w:szCs w:val="18"/>
+                <w:rtl w:val="0"/>
+              </w:rPr>
+              <w:t xml:space="preserve">7</w:t>
+            </w:r>
+            <w:r>
+              <w:rPr>
+                <w:rtl w:val="0"/>
+              </w:rPr>
+            </w:r>
+          </w:p>
+        </w:tc>
+        <w:tc>
+          <w:tcPr>
+            <w:tcBorders>
+              <w:top w:color="bfbfbf" w:space="0" w:sz="6" w:val="single"/>
+              <w:left w:color="bfbfbf" w:space="0" w:sz="6" w:val="single"/>
+              <w:bottom w:color="bfbfbf" w:space="0" w:sz="6" w:val="single"/>
+              <w:right w:color="bfbfbf" w:space="0" w:sz="6" w:val="single"/>
+            </w:tcBorders>
+            <w:tcMar>
+              <w:left w:w="105.0" w:type="dxa"/>
+              <w:right w:w="105.0" w:type="dxa"/>
+            </w:tcMar>
+          </w:tcPr>
+          <w:p>
+            <w:pPr>
+              <w:tabs>
+                <w:tab w:val="center" w:leader="none" w:pos="4419"/>
+                <w:tab w:val="right" w:leader="none" w:pos="8838"/>
+              </w:tabs>
+              <w:jc w:val="both"/>
+              <w:rPr>
+                <w:rFonts w:ascii="Calibri" w:cs="Calibri" w:eastAsia="Calibri" w:hAnsi="Calibri"/>
+                <w:i w:val="1"/>
+                <w:iCs w:val="1"/>
+                <w:color w:val="5b9bd5"/>
+                <w:sz w:val="22"/>
+                <w:szCs w:val="22"/>
+              </w:rPr>
+            </w:pPr>
+            <w:r>
+              <w:rPr>
+                <w:rFonts w:ascii="Calibri" w:cs="Calibri" w:eastAsia="Calibri" w:hAnsi="Calibri"/>
+                <w:i w:val="1"/>
+                <w:iCs w:val="1"/>
+                <w:color w:val="5b9bd5"/>
+                <w:sz w:val="22"/>
+                <w:szCs w:val="22"/>
+                <w:rtl w:val="0"/>
+              </w:rPr>
+              <w:t xml:space="preserve">Acta de constitución</w:t>
+            </w:r>
+          </w:p>
+        </w:tc>
+        <w:tc>
+          <w:tcPr>
+            <w:tcBorders>
+              <w:top w:color="bfbfbf" w:space="0" w:sz="6" w:val="single"/>
+              <w:left w:color="bfbfbf" w:space="0" w:sz="6" w:val="single"/>
+              <w:bottom w:color="bfbfbf" w:space="0" w:sz="6" w:val="single"/>
+              <w:right w:color="bfbfbf" w:space="0" w:sz="6" w:val="single"/>
+            </w:tcBorders>
+            <w:tcMar>
+              <w:left w:w="105.0" w:type="dxa"/>
+              <w:right w:w="105.0" w:type="dxa"/>
+            </w:tcMar>
+          </w:tcPr>
+          <w:p>
+            <w:pPr>
+              <w:tabs>
+                <w:tab w:val="center" w:leader="none" w:pos="4419"/>
+                <w:tab w:val="right" w:leader="none" w:pos="8838"/>
+              </w:tabs>
+              <w:jc w:val="both"/>
+              <w:rPr>
+                <w:rFonts w:ascii="Calibri" w:cs="Calibri" w:eastAsia="Calibri" w:hAnsi="Calibri"/>
+                <w:color w:val="5b9bd5"/>
+                <w:sz w:val="22"/>
+                <w:szCs w:val="22"/>
+              </w:rPr>
+            </w:pPr>
+            <w:r>
+              <w:rPr>
+                <w:rFonts w:ascii="Calibri" w:cs="Calibri" w:eastAsia="Calibri" w:hAnsi="Calibri"/>
+                <w:color w:val="5b9bd5"/>
+                <w:sz w:val="22"/>
+                <w:szCs w:val="22"/>
+                <w:rtl w:val="0"/>
+              </w:rPr>
+              <w:t xml:space="preserve">descripción de proyecto</w:t>
+            </w:r>
+          </w:p>
+        </w:tc>
+        <w:tc>
+          <w:tcPr>
+            <w:tcBorders>
+              <w:top w:color="bfbfbf" w:space="0" w:sz="6" w:val="single"/>
+              <w:left w:color="bfbfbf" w:space="0" w:sz="6" w:val="single"/>
+              <w:bottom w:color="bfbfbf" w:space="0" w:sz="6" w:val="single"/>
+              <w:right w:color="bfbfbf" w:space="0" w:sz="6" w:val="single"/>
+            </w:tcBorders>
+            <w:tcMar>
+              <w:left w:w="105.0" w:type="dxa"/>
+              <w:right w:w="105.0" w:type="dxa"/>
+            </w:tcMar>
+          </w:tcPr>
+          <w:p>
+            <w:pPr>
+              <w:tabs>
+                <w:tab w:val="center" w:leader="none" w:pos="4419"/>
+                <w:tab w:val="right" w:leader="none" w:pos="8838"/>
+              </w:tabs>
+              <w:jc w:val="both"/>
+              <w:rPr>
+                <w:rFonts w:ascii="Calibri" w:cs="Calibri" w:eastAsia="Calibri" w:hAnsi="Calibri"/>
+                <w:sz w:val="22"/>
+                <w:szCs w:val="22"/>
+              </w:rPr>
+            </w:pPr>
+            <w:hyperlink r:id="rId17">
+              <w:r>
+                <w:rPr>
+                  <w:rFonts w:ascii="Calibri" w:cs="Calibri" w:eastAsia="Calibri" w:hAnsi="Calibri"/>
+                  <w:i w:val="1"/>
+                  <w:iCs w:val="1"/>
+                  <w:color w:val="1155cc"/>
+                  <w:sz w:val="22"/>
+                  <w:szCs w:val="22"/>
+                  <w:u w:val="single"/>
+                  <w:rtl w:val="0"/>
+                </w:rPr>
+                <w:t xml:space="preserve">Acta de constitución</w:t>
+              </w:r>
+            </w:hyperlink>
+            <w:r>
+              <w:rPr>
+                <w:rtl w:val="0"/>
+              </w:rPr>
+            </w:r>
+          </w:p>
+        </w:tc>
+      </w:tr>
+      <w:tr>
+        <w:trPr>
+          <w:cantSplit w:val="0"/>
+          <w:trHeight w:val="360" w:hRule="atLeast"/>
+          <w:tblHeader w:val="0"/>
+        </w:trPr>
+        <w:tc>
+          <w:tcPr>
+            <w:tcBorders>
+              <w:top w:color="bfbfbf" w:space="0" w:sz="6" w:val="single"/>
+              <w:left w:color="bfbfbf" w:space="0" w:sz="6" w:val="single"/>
+              <w:bottom w:color="bfbfbf" w:space="0" w:sz="6" w:val="single"/>
+              <w:right w:color="bfbfbf" w:space="0" w:sz="6" w:val="single"/>
+            </w:tcBorders>
+            <w:tcMar>
+              <w:left w:w="105.0" w:type="dxa"/>
+              <w:right w:w="105.0" w:type="dxa"/>
+            </w:tcMar>
+          </w:tcPr>
+          <w:p>
+            <w:pPr>
+              <w:keepNext w:val="0"/>
+              <w:keepLines w:val="0"/>
+              <w:pageBreakBefore w:val="0"/>
+              <w:widowControl w:val="1"/>
+              <w:pBdr>
+                <w:top w:space="0" w:sz="0" w:val="nil"/>
+                <w:left w:space="0" w:sz="0" w:val="nil"/>
+                <w:bottom w:space="0" w:sz="0" w:val="nil"/>
+                <w:right w:space="0" w:sz="0" w:val="nil"/>
+                <w:between w:space="0" w:sz="0" w:val="nil"/>
+              </w:pBdr>
+              <w:shd w:fill="auto" w:val="clear"/>
+              <w:tabs>
+                <w:tab w:val="center" w:leader="none" w:pos="4419"/>
+                <w:tab w:val="right" w:leader="none" w:pos="8838"/>
+              </w:tabs>
+              <w:spacing w:after="0" w:before="0" w:line="240" w:lineRule="auto"/>
+              <w:ind w:left="0" w:right="0" w:firstLine="0"/>
+              <w:jc w:val="center"/>
+              <w:rPr>
+                <w:rFonts w:ascii="Calibri" w:cs="Calibri" w:eastAsia="Calibri" w:hAnsi="Calibri"/>
+                <w:i w:val="1"/>
+                <w:iCs w:val="1"/>
+                <w:color w:val="5b9bd5"/>
+                <w:sz w:val="18"/>
+                <w:szCs w:val="18"/>
+              </w:rPr>
+            </w:pPr>
+            <w:r>
+              <w:rPr>
+                <w:rFonts w:ascii="Calibri" w:cs="Calibri" w:eastAsia="Calibri" w:hAnsi="Calibri"/>
+                <w:i w:val="1"/>
+                <w:iCs w:val="1"/>
+                <w:color w:val="5b9bd5"/>
+                <w:sz w:val="18"/>
+                <w:szCs w:val="18"/>
+                <w:rtl w:val="0"/>
+              </w:rPr>
+              <w:t xml:space="preserve">8     </w:t>
+            </w:r>
+          </w:p>
+        </w:tc>
+        <w:tc>
+          <w:tcPr>
+            <w:tcBorders>
+              <w:top w:color="bfbfbf" w:space="0" w:sz="6" w:val="single"/>
+              <w:left w:color="bfbfbf" w:space="0" w:sz="6" w:val="single"/>
+              <w:bottom w:color="bfbfbf" w:space="0" w:sz="6" w:val="single"/>
+              <w:right w:color="bfbfbf" w:space="0" w:sz="6" w:val="single"/>
+            </w:tcBorders>
+            <w:tcMar>
+              <w:left w:w="105.0" w:type="dxa"/>
+              <w:right w:w="105.0" w:type="dxa"/>
+            </w:tcMar>
+          </w:tcPr>
+          <w:p>
+            <w:pPr>
+              <w:tabs>
+                <w:tab w:val="center" w:leader="none" w:pos="4419"/>
+                <w:tab w:val="right" w:leader="none" w:pos="8838"/>
+              </w:tabs>
+              <w:jc w:val="both"/>
+              <w:rPr>
+                <w:rFonts w:ascii="Calibri" w:cs="Calibri" w:eastAsia="Calibri" w:hAnsi="Calibri"/>
+                <w:i w:val="1"/>
+                <w:iCs w:val="1"/>
+                <w:color w:val="5b9bd5"/>
+                <w:sz w:val="22"/>
+                <w:szCs w:val="22"/>
+              </w:rPr>
+            </w:pPr>
+            <w:r>
+              <w:rPr>
+                <w:rFonts w:ascii="Calibri" w:cs="Calibri" w:eastAsia="Calibri" w:hAnsi="Calibri"/>
+                <w:i w:val="1"/>
+                <w:iCs w:val="1"/>
+                <w:color w:val="5b9bd5"/>
+                <w:sz w:val="22"/>
+                <w:szCs w:val="22"/>
+                <w:rtl w:val="0"/>
+              </w:rPr>
+              <w:t xml:space="preserve">Manual de instalación</w:t>
+            </w:r>
+          </w:p>
+        </w:tc>
+        <w:tc>
+          <w:tcPr>
+            <w:tcBorders>
+              <w:top w:color="bfbfbf" w:space="0" w:sz="6" w:val="single"/>
+              <w:left w:color="bfbfbf" w:space="0" w:sz="6" w:val="single"/>
+              <w:bottom w:color="bfbfbf" w:space="0" w:sz="6" w:val="single"/>
+              <w:right w:color="bfbfbf" w:space="0" w:sz="6" w:val="single"/>
+            </w:tcBorders>
+            <w:tcMar>
+              <w:left w:w="105.0" w:type="dxa"/>
+              <w:right w:w="105.0" w:type="dxa"/>
+            </w:tcMar>
+          </w:tcPr>
+          <w:p>
+            <w:pPr>
+              <w:tabs>
+                <w:tab w:val="center" w:leader="none" w:pos="4419"/>
+                <w:tab w:val="right" w:leader="none" w:pos="8838"/>
+              </w:tabs>
+              <w:jc w:val="both"/>
+              <w:rPr>
+                <w:rFonts w:ascii="Calibri" w:cs="Calibri" w:eastAsia="Calibri" w:hAnsi="Calibri"/>
+                <w:color w:val="5b9bd5"/>
+                <w:sz w:val="22"/>
+                <w:szCs w:val="22"/>
+              </w:rPr>
+            </w:pPr>
+            <w:r>
+              <w:rPr>
+                <w:rFonts w:ascii="Calibri" w:cs="Calibri" w:eastAsia="Calibri" w:hAnsi="Calibri"/>
+                <w:color w:val="5b9bd5"/>
+                <w:sz w:val="22"/>
+                <w:szCs w:val="22"/>
+                <w:rtl w:val="0"/>
+              </w:rPr>
+              <w:t xml:space="preserve">pasos para instalar en pc</w:t>
+            </w:r>
+          </w:p>
+        </w:tc>
+        <w:tc>
+          <w:tcPr>
+            <w:tcBorders>
+              <w:top w:color="bfbfbf" w:space="0" w:sz="6" w:val="single"/>
+              <w:left w:color="bfbfbf" w:space="0" w:sz="6" w:val="single"/>
+              <w:bottom w:color="bfbfbf" w:space="0" w:sz="6" w:val="single"/>
+              <w:right w:color="bfbfbf" w:space="0" w:sz="6" w:val="single"/>
+            </w:tcBorders>
+            <w:tcMar>
+              <w:left w:w="105.0" w:type="dxa"/>
+              <w:right w:w="105.0" w:type="dxa"/>
+            </w:tcMar>
+          </w:tcPr>
+          <w:p>
+            <w:pPr>
+              <w:tabs>
+                <w:tab w:val="center" w:leader="none" w:pos="4419"/>
+                <w:tab w:val="right" w:leader="none" w:pos="8838"/>
+              </w:tabs>
+              <w:jc w:val="both"/>
+              <w:rPr>
+                <w:rFonts w:ascii="Calibri" w:cs="Calibri" w:eastAsia="Calibri" w:hAnsi="Calibri"/>
+                <w:i w:val="1"/>
+                <w:iCs w:val="1"/>
+                <w:sz w:val="22"/>
+                <w:szCs w:val="22"/>
+              </w:rPr>
+            </w:pPr>
+            <w:hyperlink r:id="rId18">
+              <w:r>
+                <w:rPr>
+                  <w:rFonts w:ascii="Calibri" w:cs="Calibri" w:eastAsia="Calibri" w:hAnsi="Calibri"/>
+                  <w:i w:val="1"/>
+                  <w:iCs w:val="1"/>
+                  <w:color w:val="1155cc"/>
+                  <w:sz w:val="22"/>
+                  <w:szCs w:val="22"/>
+                  <w:u w:val="single"/>
+                  <w:rtl w:val="0"/>
+                </w:rPr>
+                <w:t xml:space="preserve">Manual de instalación</w:t>
+              </w:r>
+            </w:hyperlink>
+            <w:r>
+              <w:rPr>
+                <w:rtl w:val="0"/>
+              </w:rPr>
+            </w:r>
+          </w:p>
+        </w:tc>
+      </w:tr>
+      <w:tr>
+        <w:trPr>
+          <w:cantSplit w:val="0"/>
+          <w:trHeight w:val="360" w:hRule="atLeast"/>
+          <w:tblHeader w:val="0"/>
+        </w:trPr>
+        <w:tc>
+          <w:tcPr>
+            <w:tcBorders>
+              <w:top w:color="bfbfbf" w:space="0" w:sz="6" w:val="single"/>
+              <w:left w:color="bfbfbf" w:space="0" w:sz="6" w:val="single"/>
+              <w:bottom w:color="bfbfbf" w:space="0" w:sz="6" w:val="single"/>
+              <w:right w:color="bfbfbf" w:space="0" w:sz="6" w:val="single"/>
+            </w:tcBorders>
+            <w:tcMar>
+              <w:left w:w="105.0" w:type="dxa"/>
+              <w:right w:w="105.0" w:type="dxa"/>
+            </w:tcMar>
+          </w:tcPr>
+          <w:p>
+            <w:pPr>
+              <w:keepNext w:val="0"/>
+              <w:keepLines w:val="0"/>
+              <w:pageBreakBefore w:val="0"/>
+              <w:widowControl w:val="1"/>
+              <w:pBdr>
+                <w:top w:space="0" w:sz="0" w:val="nil"/>
+                <w:left w:space="0" w:sz="0" w:val="nil"/>
+                <w:bottom w:space="0" w:sz="0" w:val="nil"/>
+                <w:right w:space="0" w:sz="0" w:val="nil"/>
+                <w:between w:space="0" w:sz="0" w:val="nil"/>
+              </w:pBdr>
+              <w:shd w:fill="auto" w:val="clear"/>
+              <w:tabs>
+                <w:tab w:val="center" w:leader="none" w:pos="4419"/>
+                <w:tab w:val="right" w:leader="none" w:pos="8838"/>
+              </w:tabs>
+              <w:spacing w:after="0" w:before="0" w:line="240" w:lineRule="auto"/>
+              <w:ind w:left="0" w:right="0" w:firstLine="0"/>
+              <w:jc w:val="center"/>
+              <w:rPr>
+                <w:rFonts w:ascii="Calibri" w:cs="Calibri" w:eastAsia="Calibri" w:hAnsi="Calibri"/>
+                <w:i w:val="1"/>
+                <w:iCs w:val="1"/>
+                <w:color w:val="5b9bd5"/>
+                <w:sz w:val="18"/>
+                <w:szCs w:val="18"/>
+              </w:rPr>
+            </w:pPr>
+            <w:r>
+              <w:rPr>
+                <w:rFonts w:ascii="Calibri" w:cs="Calibri" w:eastAsia="Calibri" w:hAnsi="Calibri"/>
+                <w:i w:val="1"/>
+                <w:iCs w:val="1"/>
+                <w:color w:val="5b9bd5"/>
+                <w:sz w:val="18"/>
+                <w:szCs w:val="18"/>
+                <w:rtl w:val="0"/>
+              </w:rPr>
+              <w:t xml:space="preserve">9</w:t>
+            </w:r>
+          </w:p>
+        </w:tc>
+        <w:tc>
+          <w:tcPr>
+            <w:tcBorders>
+              <w:top w:color="bfbfbf" w:space="0" w:sz="6" w:val="single"/>
+              <w:left w:color="bfbfbf" w:space="0" w:sz="6" w:val="single"/>
+              <w:bottom w:color="bfbfbf" w:space="0" w:sz="6" w:val="single"/>
+              <w:right w:color="bfbfbf" w:space="0" w:sz="6" w:val="single"/>
+            </w:tcBorders>
+            <w:tcMar>
+              <w:left w:w="105.0" w:type="dxa"/>
+              <w:right w:w="105.0" w:type="dxa"/>
+            </w:tcMar>
+          </w:tcPr>
+          <w:p>
+            <w:pPr>
+              <w:tabs>
+                <w:tab w:val="center" w:leader="none" w:pos="4419"/>
+                <w:tab w:val="right" w:leader="none" w:pos="8838"/>
+              </w:tabs>
+              <w:jc w:val="both"/>
+              <w:rPr>
+                <w:rFonts w:ascii="Calibri" w:cs="Calibri" w:eastAsia="Calibri" w:hAnsi="Calibri"/>
+                <w:i w:val="1"/>
+                <w:iCs w:val="1"/>
+                <w:color w:val="5b9bd5"/>
+                <w:sz w:val="22"/>
+                <w:szCs w:val="22"/>
+              </w:rPr>
+            </w:pPr>
+            <w:r>
+              <w:rPr>
+                <w:rFonts w:ascii="Calibri" w:cs="Calibri" w:eastAsia="Calibri" w:hAnsi="Calibri"/>
+                <w:i w:val="1"/>
+                <w:iCs w:val="1"/>
+                <w:color w:val="5b9bd5"/>
+                <w:sz w:val="22"/>
+                <w:szCs w:val="22"/>
+                <w:rtl w:val="0"/>
+              </w:rPr>
+              <w:t xml:space="preserve">manual de usuario</w:t>
+            </w:r>
+          </w:p>
+        </w:tc>
+        <w:tc>
+          <w:tcPr>
+            <w:tcBorders>
+              <w:top w:color="bfbfbf" w:space="0" w:sz="6" w:val="single"/>
+              <w:left w:color="bfbfbf" w:space="0" w:sz="6" w:val="single"/>
+              <w:bottom w:color="bfbfbf" w:space="0" w:sz="6" w:val="single"/>
+              <w:right w:color="bfbfbf" w:space="0" w:sz="6" w:val="single"/>
+            </w:tcBorders>
+            <w:tcMar>
+              <w:left w:w="105.0" w:type="dxa"/>
+              <w:right w:w="105.0" w:type="dxa"/>
+            </w:tcMar>
+          </w:tcPr>
+          <w:p>
+            <w:pPr>
+              <w:tabs>
+                <w:tab w:val="center" w:leader="none" w:pos="4419"/>
+                <w:tab w:val="right" w:leader="none" w:pos="8838"/>
+              </w:tabs>
+              <w:jc w:val="both"/>
+              <w:rPr>
+                <w:rFonts w:ascii="Calibri" w:cs="Calibri" w:eastAsia="Calibri" w:hAnsi="Calibri"/>
+                <w:color w:val="5b9bd5"/>
+                <w:sz w:val="22"/>
+                <w:szCs w:val="22"/>
+              </w:rPr>
+            </w:pPr>
+            <w:r>
+              <w:rPr>
+                <w:rFonts w:ascii="Calibri" w:cs="Calibri" w:eastAsia="Calibri" w:hAnsi="Calibri"/>
+                <w:color w:val="5b9bd5"/>
+                <w:sz w:val="22"/>
+                <w:szCs w:val="22"/>
+                <w:rtl w:val="0"/>
+              </w:rPr>
+              <w:t xml:space="preserve">roles y distribución </w:t>
+            </w:r>
+          </w:p>
+        </w:tc>
+        <w:tc>
+          <w:tcPr>
+            <w:tcBorders>
+              <w:top w:color="bfbfbf" w:space="0" w:sz="6" w:val="single"/>
+              <w:left w:color="bfbfbf" w:space="0" w:sz="6" w:val="single"/>
+              <w:bottom w:color="bfbfbf" w:space="0" w:sz="6" w:val="single"/>
+              <w:right w:color="bfbfbf" w:space="0" w:sz="6" w:val="single"/>
+            </w:tcBorders>
+            <w:tcMar>
+              <w:left w:w="105.0" w:type="dxa"/>
+              <w:right w:w="105.0" w:type="dxa"/>
+            </w:tcMar>
+          </w:tcPr>
+          <w:p>
+            <w:pPr>
+              <w:tabs>
+                <w:tab w:val="center" w:leader="none" w:pos="4419"/>
+                <w:tab w:val="right" w:leader="none" w:pos="8838"/>
+              </w:tabs>
+              <w:jc w:val="both"/>
+              <w:rPr>
+                <w:rFonts w:ascii="Calibri" w:cs="Calibri" w:eastAsia="Calibri" w:hAnsi="Calibri"/>
+                <w:i w:val="1"/>
+                <w:iCs w:val="1"/>
+                <w:sz w:val="22"/>
+                <w:szCs w:val="22"/>
+              </w:rPr>
+            </w:pPr>
+            <w:hyperlink r:id="rId19">
+              <w:r>
+                <w:rPr>
+                  <w:rFonts w:ascii="Calibri" w:cs="Calibri" w:eastAsia="Calibri" w:hAnsi="Calibri"/>
+                  <w:i w:val="1"/>
+                  <w:iCs w:val="1"/>
+                  <w:color w:val="1155cc"/>
+                  <w:sz w:val="22"/>
+                  <w:szCs w:val="22"/>
+                  <w:u w:val="single"/>
+                  <w:rtl w:val="0"/>
+                </w:rPr>
+                <w:t xml:space="preserve">manual de usuario</w:t>
+              </w:r>
+            </w:hyperlink>
+            <w:r>
+              <w:rPr>
+                <w:rtl w:val="0"/>
+              </w:rPr>
+            </w:r>
+          </w:p>
+        </w:tc>
+      </w:tr>
+      <w:tr>
+        <w:trPr>
+          <w:cantSplit w:val="0"/>
+          <w:trHeight w:val="360" w:hRule="atLeast"/>
+          <w:tblHeader w:val="0"/>
+        </w:trPr>
+        <w:tc>
+          <w:tcPr>
+            <w:tcBorders>
+              <w:top w:color="bfbfbf" w:space="0" w:sz="6" w:val="single"/>
+              <w:left w:color="bfbfbf" w:space="0" w:sz="6" w:val="single"/>
+              <w:bottom w:color="bfbfbf" w:space="0" w:sz="6" w:val="single"/>
+              <w:right w:color="bfbfbf" w:space="0" w:sz="6" w:val="single"/>
+            </w:tcBorders>
+            <w:tcMar>
+              <w:left w:w="105.0" w:type="dxa"/>
+              <w:right w:w="105.0" w:type="dxa"/>
+            </w:tcMar>
+          </w:tcPr>
+          <w:p>
+            <w:pPr>
+              <w:keepNext w:val="0"/>
+              <w:keepLines w:val="0"/>
+              <w:pageBreakBefore w:val="0"/>
+              <w:widowControl w:val="1"/>
+              <w:pBdr>
+                <w:top w:space="0" w:sz="0" w:val="nil"/>
+                <w:left w:space="0" w:sz="0" w:val="nil"/>
+                <w:bottom w:space="0" w:sz="0" w:val="nil"/>
+                <w:right w:space="0" w:sz="0" w:val="nil"/>
+                <w:between w:space="0" w:sz="0" w:val="nil"/>
+              </w:pBdr>
+              <w:shd w:fill="auto" w:val="clear"/>
+              <w:tabs>
+                <w:tab w:val="center" w:leader="none" w:pos="4419"/>
+                <w:tab w:val="right" w:leader="none" w:pos="8838"/>
+              </w:tabs>
+              <w:spacing w:after="0" w:before="0" w:line="240" w:lineRule="auto"/>
+              <w:ind w:left="0" w:right="0" w:firstLine="0"/>
+              <w:jc w:val="center"/>
+              <w:rPr>
+                <w:rFonts w:ascii="Calibri" w:cs="Calibri" w:eastAsia="Calibri" w:hAnsi="Calibri"/>
+                <w:i w:val="1"/>
+                <w:iCs w:val="1"/>
+                <w:color w:val="5b9bd5"/>
+                <w:sz w:val="18"/>
+                <w:szCs w:val="18"/>
+              </w:rPr>
+            </w:pPr>
+            <w:r>
+              <w:rPr>
+                <w:rFonts w:ascii="Calibri" w:cs="Calibri" w:eastAsia="Calibri" w:hAnsi="Calibri"/>
+                <w:i w:val="1"/>
+                <w:iCs w:val="1"/>
+                <w:color w:val="5b9bd5"/>
+                <w:sz w:val="18"/>
+                <w:szCs w:val="18"/>
+                <w:rtl w:val="0"/>
+              </w:rPr>
+              <w:t xml:space="preserve">10      </w:t>
+            </w:r>
+          </w:p>
+        </w:tc>
+        <w:tc>
+          <w:tcPr>
+            <w:tcBorders>
+              <w:top w:color="bfbfbf" w:space="0" w:sz="6" w:val="single"/>
+              <w:left w:color="bfbfbf" w:space="0" w:sz="6" w:val="single"/>
+              <w:bottom w:color="bfbfbf" w:space="0" w:sz="6" w:val="single"/>
+              <w:right w:color="bfbfbf" w:space="0" w:sz="6" w:val="single"/>
+            </w:tcBorders>
+            <w:tcMar>
+              <w:left w:w="105.0" w:type="dxa"/>
+              <w:right w:w="105.0" w:type="dxa"/>
+            </w:tcMar>
+          </w:tcPr>
+          <w:p>
+            <w:pPr>
+              <w:tabs>
+                <w:tab w:val="center" w:leader="none" w:pos="4419"/>
+                <w:tab w:val="right" w:leader="none" w:pos="8838"/>
+              </w:tabs>
+              <w:jc w:val="both"/>
+              <w:rPr>
+                <w:rFonts w:ascii="Calibri" w:cs="Calibri" w:eastAsia="Calibri" w:hAnsi="Calibri"/>
+                <w:i w:val="1"/>
+                <w:iCs w:val="1"/>
+                <w:color w:val="5b9bd5"/>
+                <w:sz w:val="22"/>
+                <w:szCs w:val="22"/>
+              </w:rPr>
+            </w:pPr>
+            <w:r>
+              <w:rPr>
+                <w:rFonts w:ascii="Calibri" w:cs="Calibri" w:eastAsia="Calibri" w:hAnsi="Calibri"/>
+                <w:i w:val="1"/>
+                <w:iCs w:val="1"/>
+                <w:color w:val="5b9bd5"/>
+                <w:sz w:val="22"/>
+                <w:szCs w:val="22"/>
+                <w:rtl w:val="0"/>
+              </w:rPr>
+              <w:t xml:space="preserve">diagrama de base de datos</w:t>
+            </w:r>
+          </w:p>
+        </w:tc>
+        <w:tc>
+          <w:tcPr>
+            <w:tcBorders>
+              <w:top w:color="bfbfbf" w:space="0" w:sz="6" w:val="single"/>
+              <w:left w:color="bfbfbf" w:space="0" w:sz="6" w:val="single"/>
+              <w:bottom w:color="bfbfbf" w:space="0" w:sz="6" w:val="single"/>
+              <w:right w:color="bfbfbf" w:space="0" w:sz="6" w:val="single"/>
+            </w:tcBorders>
+            <w:tcMar>
+              <w:left w:w="105.0" w:type="dxa"/>
+              <w:right w:w="105.0" w:type="dxa"/>
+            </w:tcMar>
+          </w:tcPr>
+          <w:p>
+            <w:pPr>
+              <w:tabs>
+                <w:tab w:val="center" w:leader="none" w:pos="4419"/>
+                <w:tab w:val="right" w:leader="none" w:pos="8838"/>
+              </w:tabs>
+              <w:jc w:val="both"/>
+              <w:rPr>
+                <w:rFonts w:ascii="Calibri" w:cs="Calibri" w:eastAsia="Calibri" w:hAnsi="Calibri"/>
+                <w:color w:val="5b9bd5"/>
+                <w:sz w:val="22"/>
+                <w:szCs w:val="22"/>
+              </w:rPr>
+            </w:pPr>
+            <w:r>
+              <w:rPr>
+                <w:rFonts w:ascii="Calibri" w:cs="Calibri" w:eastAsia="Calibri" w:hAnsi="Calibri"/>
+                <w:color w:val="5b9bd5"/>
+                <w:sz w:val="22"/>
+                <w:szCs w:val="22"/>
+                <w:rtl w:val="0"/>
+              </w:rPr>
+              <w:t xml:space="preserve">tablas de base de datos</w:t>
+            </w:r>
+          </w:p>
+        </w:tc>
+        <w:tc>
+          <w:tcPr>
+            <w:tcBorders>
+              <w:top w:color="bfbfbf" w:space="0" w:sz="6" w:val="single"/>
+              <w:left w:color="bfbfbf" w:space="0" w:sz="6" w:val="single"/>
+              <w:bottom w:color="bfbfbf" w:space="0" w:sz="6" w:val="single"/>
+              <w:right w:color="bfbfbf" w:space="0" w:sz="6" w:val="single"/>
+            </w:tcBorders>
+            <w:tcMar>
+              <w:left w:w="105.0" w:type="dxa"/>
+              <w:right w:w="105.0" w:type="dxa"/>
+            </w:tcMar>
+          </w:tcPr>
+          <w:p>
+            <w:pPr>
+              <w:tabs>
+                <w:tab w:val="center" w:leader="none" w:pos="4419"/>
+                <w:tab w:val="right" w:leader="none" w:pos="8838"/>
+              </w:tabs>
+              <w:jc w:val="both"/>
+              <w:rPr>
+                <w:rFonts w:ascii="Calibri" w:cs="Calibri" w:eastAsia="Calibri" w:hAnsi="Calibri"/>
+                <w:i w:val="1"/>
+                <w:iCs w:val="1"/>
+                <w:sz w:val="22"/>
+                <w:szCs w:val="22"/>
+              </w:rPr>
+            </w:pPr>
+            <w:hyperlink r:id="rId20">
+              <w:r>
+                <w:rPr>
+                  <w:rFonts w:ascii="Calibri" w:cs="Calibri" w:eastAsia="Calibri" w:hAnsi="Calibri"/>
+                  <w:i w:val="1"/>
+                  <w:iCs w:val="1"/>
+                  <w:color w:val="1155cc"/>
+                  <w:sz w:val="22"/>
+                  <w:szCs w:val="22"/>
+                  <w:u w:val="single"/>
+                  <w:rtl w:val="0"/>
+                </w:rPr>
+                <w:t xml:space="preserve">diagrama base de datos</w:t>
+              </w:r>
+            </w:hyperlink>
+            <w:r>
+              <w:rPr>
+                <w:rtl w:val="0"/>
+              </w:rPr>
+            </w:r>
+          </w:p>
+        </w:tc>
+      </w:tr>
     </w:tbl>
-    <w:p>
-      <w:pPr>
-        <w:spacing w:line="360" w:lineRule="auto"/>
-        <w:jc w:val="both"/>
-        <w:rPr>
-          <w:rFonts w:ascii="Calibri" w:cs="Calibri" w:eastAsia="Calibri" w:hAnsi="Calibri"/>
-        </w:rPr>
-      </w:pPr>
-      <w:r>
-        <w:rPr>
-          <w:rtl w:val="0"/>
-        </w:rPr>
-      </w:r>
-    </w:p>
-    <w:p>
-      <w:pPr>
-        <w:spacing w:line="360" w:lineRule="auto"/>
-        <w:jc w:val="both"/>
-        <w:rPr>
-          <w:rFonts w:ascii="Calibri" w:cs="Calibri" w:eastAsia="Calibri" w:hAnsi="Calibri"/>
-        </w:rPr>
-      </w:pPr>
-      <w:r>
-        <w:rPr>
-          <w:rtl w:val="0"/>
-        </w:rPr>
-      </w:r>
-    </w:p>
-    <w:p>
-      <w:pPr>
-        <w:spacing w:line="360" w:lineRule="auto"/>
-        <w:jc w:val="both"/>
-        <w:rPr>
-          <w:rFonts w:ascii="Calibri" w:cs="Calibri" w:eastAsia="Calibri" w:hAnsi="Calibri"/>
-        </w:rPr>
-      </w:pPr>
-      <w:r>
-        <w:rPr>
-          <w:rtl w:val="0"/>
-        </w:rPr>
-      </w:r>
-    </w:p>
-    <w:p>
-      <w:pPr>
-        <w:spacing w:line="360" w:lineRule="auto"/>
-        <w:jc w:val="both"/>
-        <w:rPr>
-          <w:rFonts w:ascii="Calibri" w:cs="Calibri" w:eastAsia="Calibri" w:hAnsi="Calibri"/>
-        </w:rPr>
-      </w:pPr>
-      <w:r>
-        <w:rPr>
-          <w:rtl w:val="0"/>
-        </w:rPr>
-      </w:r>
-    </w:p>
-    <w:p>
-      <w:pPr>
-        <w:spacing w:line="360" w:lineRule="auto"/>
-        <w:jc w:val="both"/>
-        <w:rPr>
-          <w:rFonts w:ascii="Calibri" w:cs="Calibri" w:eastAsia="Calibri" w:hAnsi="Calibri"/>
-        </w:rPr>
-      </w:pPr>
-      <w:r>
-        <w:rPr>
-          <w:rtl w:val="0"/>
-        </w:rPr>
-      </w:r>
-    </w:p>
-    <w:p>
-      <w:pPr>
-        <w:spacing w:line="360" w:lineRule="auto"/>
-        <w:jc w:val="both"/>
-        <w:rPr>
-          <w:rFonts w:ascii="Calibri" w:cs="Calibri" w:eastAsia="Calibri" w:hAnsi="Calibri"/>
-        </w:rPr>
-      </w:pPr>
-      <w:r>
-        <w:rPr>
-          <w:rtl w:val="0"/>
-        </w:rPr>
-      </w:r>
-    </w:p>
-    <w:p>
-      <w:pPr>
-        <w:spacing w:line="360" w:lineRule="auto"/>
-        <w:jc w:val="both"/>
-        <w:rPr>
-          <w:rFonts w:ascii="Calibri" w:cs="Calibri" w:eastAsia="Calibri" w:hAnsi="Calibri"/>
-        </w:rPr>
-      </w:pPr>
-      <w:r>
-        <w:rPr>
-          <w:rtl w:val="0"/>
-        </w:rPr>
-      </w:r>
-    </w:p>
-    <w:p>
-      <w:pPr>
-        <w:spacing w:line="360" w:lineRule="auto"/>
-        <w:jc w:val="both"/>
-        <w:rPr>
-          <w:rFonts w:ascii="Calibri" w:cs="Calibri" w:eastAsia="Calibri" w:hAnsi="Calibri"/>
-        </w:rPr>
-      </w:pPr>
-      <w:r>
-        <w:rPr>
-          <w:rtl w:val="0"/>
-        </w:rPr>
-      </w:r>
-    </w:p>
     <w:p>
       <w:pPr>
         <w:spacing w:line="360" w:lineRule="auto"/>
@@ -11486,6 +11995,48 @@
         </w:tc>
       </w:tr>
     </w:tbl>
+    <w:p>
+      <w:pPr>
+        <w:spacing w:line="360" w:lineRule="auto"/>
+        <w:jc w:val="both"/>
+        <w:rPr>
+          <w:rFonts w:ascii="Calibri" w:cs="Calibri" w:eastAsia="Calibri" w:hAnsi="Calibri"/>
+        </w:rPr>
+      </w:pPr>
+      <w:r>
+        <w:rPr>
+          <w:rtl w:val="0"/>
+        </w:rPr>
+      </w:r>
+    </w:p>
+    <w:p>
+      <w:pPr>
+        <w:spacing w:line="360" w:lineRule="auto"/>
+        <w:jc w:val="both"/>
+        <w:rPr>
+          <w:rFonts w:ascii="Calibri" w:cs="Calibri" w:eastAsia="Calibri" w:hAnsi="Calibri"/>
+        </w:rPr>
+      </w:pPr>
+      <w:r>
+        <w:rPr>
+          <w:rtl w:val="0"/>
+        </w:rPr>
+      </w:r>
+    </w:p>
+    <w:p>
+      <w:pPr>
+        <w:spacing w:line="360" w:lineRule="auto"/>
+        <w:jc w:val="both"/>
+        <w:rPr>
+          <w:rFonts w:ascii="Calibri" w:cs="Calibri" w:eastAsia="Calibri" w:hAnsi="Calibri"/>
+        </w:rPr>
+      </w:pPr>
+      <w:r>
+        <w:rPr>
+          <w:rtl w:val="0"/>
+        </w:rPr>
+      </w:r>
+    </w:p>
     <w:p>
       <w:pPr>
         <w:spacing w:line="360" w:lineRule="auto"/>
@@ -14350,16 +14901,16 @@
           <wp:inline distB="114300" distT="114300" distL="114300" distR="114300">
             <wp:extent cx="5610225" cy="3296870"/>
             <wp:effectExtent b="0" l="0" r="0" t="0"/>
-            <wp:docPr id="2106009979" name="image6.png"/>
+            <wp:docPr id="2106009979" name="image4.png"/>
             <a:graphic>
               <a:graphicData uri="http://schemas.openxmlformats.org/drawingml/2006/picture">
                 <pic:pic>
                   <pic:nvPicPr>
-                    <pic:cNvPr id="0" name="image6.png"/>
+                    <pic:cNvPr id="0" name="image4.png"/>
                     <pic:cNvPicPr preferRelativeResize="0"/>
                   </pic:nvPicPr>
                   <pic:blipFill>
-                    <a:blip r:embed="rId17"/>
+                    <a:blip r:embed="rId21"/>
                     <a:srcRect b="0" l="0" r="0" t="0"/>
                     <a:stretch>
                       <a:fillRect/>
@@ -14631,7 +15182,7 @@
                 <w:szCs w:val="20"/>
               </w:rPr>
             </w:pPr>
-            <w:hyperlink r:id="rId18">
+            <w:hyperlink r:id="rId22">
               <w:r>
                 <w:rPr>
                   <w:rFonts w:ascii="Calibri" w:cs="Calibri" w:eastAsia="Calibri" w:hAnsi="Calibri"/>
@@ -14749,8 +15300,8 @@
       </w:r>
     </w:p>
     <w:sectPr>
-      <w:headerReference r:id="rId19" w:type="default"/>
-      <w:footerReference r:id="rId20" w:type="default"/>
+      <w:headerReference r:id="rId23" w:type="default"/>
+      <w:footerReference r:id="rId24" w:type="default"/>
       <w:pgSz w:h="18720" w:w="12240" w:orient="portrait"/>
       <w:pgMar w:bottom="1417" w:top="1417" w:left="1701" w:right="1701" w:header="708" w:footer="1202"/>
       <w:pgNumType w:start="1"/>
@@ -15041,12 +15592,12 @@
         <wp:inline distB="0" distT="0" distL="0" distR="0">
           <wp:extent cx="1869144" cy="498662"/>
           <wp:effectExtent b="0" l="0" r="0" t="0"/>
-          <wp:docPr descr="Texto&#10;&#10;Descripción generada automáticamente con confianza media" id="2106009983" name="image5.jpg"/>
+          <wp:docPr descr="Texto&#10;&#10;Descripción generada automáticamente con confianza media" id="2106009983" name="image3.jpg"/>
           <a:graphic>
             <a:graphicData uri="http://schemas.openxmlformats.org/drawingml/2006/picture">
               <pic:pic>
                 <pic:nvPicPr>
-                  <pic:cNvPr descr="Texto&#10;&#10;Descripción generada automáticamente con confianza media" id="0" name="image5.jpg"/>
+                  <pic:cNvPr descr="Texto&#10;&#10;Descripción generada automáticamente con confianza media" id="0" name="image3.jpg"/>
                   <pic:cNvPicPr preferRelativeResize="0"/>
                 </pic:nvPicPr>
                 <pic:blipFill>

</xml_diff>